<commit_message>
Correct report figures and result analysis
</commit_message>
<xml_diff>
--- a/report_排版优化版.docx
+++ b/report_排版优化版.docx
@@ -1505,7 +1505,7 @@
         </w:rPr>
         <w:drawing>
           <wp:inline distT="0" distB="0" distL="0" distR="0" wp14:anchorId="15D3616C" wp14:editId="694D2AB9">
-            <wp:extent cx="5112000" cy="1661400"/>
+            <wp:extent cx="5112000" cy="1760400"/>
             <wp:effectExtent l="0" t="0" r="0" b="0"/>
             <wp:docPr id="1" name="Picture 1"/>
             <wp:cNvGraphicFramePr>
@@ -1527,7 +1527,7 @@
                   <pic:spPr>
                     <a:xfrm>
                       <a:off x="0" y="0"/>
-                      <a:ext cx="5112000" cy="1661400"/>
+                      <a:ext cx="5112000" cy="1760400"/>
                     </a:xfrm>
                     <a:prstGeom prst="rect">
                       <a:avLst/>
@@ -4319,6 +4319,24 @@
     </w:p>
     <w:p>
       <w:pPr>
+        <w:spacing w:after="80" w:line="283" w:lineRule="auto"/>
+        <w:ind w:firstLine="420"/>
+        <w:jc w:val="both"/>
+        <w:rPr>
+          <w:lang w:eastAsia="zh-CN"/>
+        </w:rPr>
+      </w:pPr>
+      <w:r>
+        <w:rPr>
+          <w:color w:val="000000"/>
+          <w:sz w:val="21"/>
+          <w:lang w:eastAsia="zh-CN"/>
+        </w:rPr>
+        <w:t>批量评测结果说明：Accuracy 为 90.00%、F1 为 88.30%，表明模型在验证集上保持了较好的综合判别能力；Precision 为 89.88%、Recall 为 86.78%。混淆矩阵中 FP=17、FN=23，漏判数量高于误报数量，说明模型对“谣言”类别的判断相对谨慎。</w:t>
+      </w:r>
+    </w:p>
+    <w:p>
+      <w:pPr>
         <w:keepNext/>
         <w:spacing w:before="100" w:after="60" w:line="276" w:lineRule="auto"/>
       </w:pPr>
@@ -4687,135 +4705,7 @@
           <w:sz w:val="21"/>
           <w:lang w:eastAsia="zh-CN"/>
         </w:rPr>
-        <w:t>结果说明：</w:t>
-      </w:r>
-      <w:r>
-        <w:rPr>
-          <w:color w:val="000000"/>
-          <w:sz w:val="21"/>
-          <w:lang w:eastAsia="zh-CN"/>
-        </w:rPr>
-        <w:t xml:space="preserve">Precision </w:t>
-      </w:r>
-      <w:r>
-        <w:rPr>
-          <w:color w:val="000000"/>
-          <w:sz w:val="21"/>
-          <w:lang w:eastAsia="zh-CN"/>
-        </w:rPr>
-        <w:t>接近</w:t>
-      </w:r>
-      <w:r>
-        <w:rPr>
-          <w:color w:val="000000"/>
-          <w:sz w:val="21"/>
-          <w:lang w:eastAsia="zh-CN"/>
-        </w:rPr>
-        <w:t xml:space="preserve"> 90%</w:t>
-      </w:r>
-      <w:r>
-        <w:rPr>
-          <w:color w:val="000000"/>
-          <w:sz w:val="21"/>
-          <w:lang w:eastAsia="zh-CN"/>
-        </w:rPr>
-        <w:t>，说明模型对</w:t>
-      </w:r>
-      <w:r>
-        <w:rPr>
-          <w:color w:val="000000"/>
-          <w:sz w:val="21"/>
-          <w:lang w:eastAsia="zh-CN"/>
-        </w:rPr>
-        <w:t>“</w:t>
-      </w:r>
-      <w:r>
-        <w:rPr>
-          <w:color w:val="000000"/>
-          <w:sz w:val="21"/>
-          <w:lang w:eastAsia="zh-CN"/>
-        </w:rPr>
-        <w:t>谣言</w:t>
-      </w:r>
-      <w:r>
-        <w:rPr>
-          <w:color w:val="000000"/>
-          <w:sz w:val="21"/>
-          <w:lang w:eastAsia="zh-CN"/>
-        </w:rPr>
-        <w:t>”</w:t>
-      </w:r>
-      <w:r>
-        <w:rPr>
-          <w:color w:val="000000"/>
-          <w:sz w:val="21"/>
-          <w:lang w:eastAsia="zh-CN"/>
-        </w:rPr>
-        <w:t>预测较谨慎；</w:t>
-      </w:r>
-      <w:r>
-        <w:rPr>
-          <w:color w:val="000000"/>
-          <w:sz w:val="21"/>
-          <w:lang w:eastAsia="zh-CN"/>
-        </w:rPr>
-        <w:t xml:space="preserve">Recall </w:t>
-      </w:r>
-      <w:r>
-        <w:rPr>
-          <w:color w:val="000000"/>
-          <w:sz w:val="21"/>
-          <w:lang w:eastAsia="zh-CN"/>
-        </w:rPr>
-        <w:t>为</w:t>
-      </w:r>
-      <w:r>
-        <w:rPr>
-          <w:color w:val="000000"/>
-          <w:sz w:val="21"/>
-          <w:lang w:eastAsia="zh-CN"/>
-        </w:rPr>
-        <w:t xml:space="preserve"> 86.78%</w:t>
-      </w:r>
-      <w:r>
-        <w:rPr>
-          <w:color w:val="000000"/>
-          <w:sz w:val="21"/>
-          <w:lang w:eastAsia="zh-CN"/>
-        </w:rPr>
-        <w:t>，仍有</w:t>
-      </w:r>
-      <w:r>
-        <w:rPr>
-          <w:color w:val="000000"/>
-          <w:sz w:val="21"/>
-          <w:lang w:eastAsia="zh-CN"/>
-        </w:rPr>
-        <w:t xml:space="preserve"> 23 </w:t>
-      </w:r>
-      <w:r>
-        <w:rPr>
-          <w:color w:val="000000"/>
-          <w:sz w:val="21"/>
-          <w:lang w:eastAsia="zh-CN"/>
-        </w:rPr>
-        <w:t>条谣言漏判，后续可优先分析</w:t>
-      </w:r>
-      <w:r>
-        <w:rPr>
-          <w:color w:val="000000"/>
-          <w:sz w:val="21"/>
-          <w:lang w:eastAsia="zh-CN"/>
-        </w:rPr>
-        <w:t xml:space="preserve"> FN/FP </w:t>
-      </w:r>
-      <w:r>
-        <w:rPr>
-          <w:color w:val="000000"/>
-          <w:sz w:val="21"/>
-          <w:lang w:eastAsia="zh-CN"/>
-        </w:rPr>
-        <w:t>集中事件，并继续优化事件内阈值和证据扰动方法。</w:t>
+        <w:t>单条检测结果说明：系统将该 event=1 样例判定为谣言，谣言概率为 94.75%，非谣言概率为 5.25%，预测结果与 val.csv 中的真实标签 label=1 一致。这里的置信度表示分类模型在两个类别之间的相对判断强度，不等同于外部事实核查结论。</w:t>
       </w:r>
     </w:p>
     <w:p>
@@ -6851,17 +6741,7 @@
           <w:sz w:val="30"/>
           <w:lang w:eastAsia="zh-CN"/>
         </w:rPr>
-        <w:t>9</w:t>
-      </w:r>
-      <w:r>
-        <w:rPr>
-          <w:rFonts w:eastAsia="黑体"/>
-          <w:b/>
-          <w:color w:val="000000"/>
-          <w:sz w:val="30"/>
-          <w:lang w:eastAsia="zh-CN"/>
-        </w:rPr>
-        <w:t>、小组协作与改进方向</w:t>
+        <w:t>9、小组协作与项目完成情况</w:t>
       </w:r>
     </w:p>
     <w:tbl>
@@ -7261,19 +7141,9 @@
             <w:vAlign w:val="center"/>
           </w:tcPr>
           <w:p>
-            <w:pPr>
-              <w:keepLines/>
-              <w:spacing w:after="0" w:line="252" w:lineRule="auto"/>
-            </w:pPr>
-            <w:proofErr w:type="spellStart"/>
             <w:r>
-              <w:rPr>
-                <w:color w:val="000000"/>
-                <w:sz w:val="21"/>
-              </w:rPr>
-              <w:t>后续优化</w:t>
+              <w:t>质量核验</w:t>
             </w:r>
-            <w:proofErr w:type="spellEnd"/>
           </w:p>
         </w:tc>
         <w:tc>
@@ -7288,41 +7158,8 @@
             <w:vAlign w:val="center"/>
           </w:tcPr>
           <w:p>
-            <w:pPr>
-              <w:keepLines/>
-              <w:spacing w:after="0" w:line="252" w:lineRule="auto"/>
-            </w:pPr>
-            <w:proofErr w:type="spellStart"/>
             <w:r>
-              <w:rPr>
-                <w:color w:val="000000"/>
-                <w:sz w:val="21"/>
-              </w:rPr>
-              <w:t>分析错误集中事件；补充去重后指标；归档</w:t>
-            </w:r>
-            <w:proofErr w:type="spellEnd"/>
-            <w:r>
-              <w:rPr>
-                <w:color w:val="000000"/>
-                <w:sz w:val="21"/>
-              </w:rPr>
-              <w:t xml:space="preserve"> checkpoint </w:t>
-            </w:r>
-            <w:proofErr w:type="spellStart"/>
-            <w:r>
-              <w:rPr>
-                <w:color w:val="000000"/>
-                <w:sz w:val="21"/>
-              </w:rPr>
-              <w:t>与评测</w:t>
-            </w:r>
-            <w:proofErr w:type="spellEnd"/>
-            <w:r>
-              <w:rPr>
-                <w:color w:val="000000"/>
-                <w:sz w:val="21"/>
-              </w:rPr>
-              <w:t xml:space="preserve"> JSON</w:t>
+              <w:t>核验数据字段与标签分布；复查 val 指标、运行命令、checkpoint 与评测 JSON</w:t>
             </w:r>
           </w:p>
         </w:tc>

</xml_diff>

<commit_message>
Condense report below word limit
</commit_message>
<xml_diff>
--- a/report_排版优化版.docx
+++ b/report_排版优化版.docx
@@ -542,166 +542,14 @@
           <w:sz w:val="21"/>
           <w:lang w:eastAsia="zh-CN"/>
         </w:rPr>
-        <w:t>本项目实现了一个可运行、可解释的</w:t>
+        <w:t>本项目实现英文推文谣言检测系统。系统基于 train.csv 按 7 个事件训练 Twitter-RoBERTa，并融合 TF-IDF Logistic Regression；预测后检索相似案例，由受约束 LLM 整理中文依据。CLI 与 WebUI 支持训练、预测和批量评测。</w:t>
       </w:r>
       <w:proofErr w:type="gramStart"/>
-      <w:r>
-        <w:rPr>
-          <w:color w:val="000000"/>
-          <w:sz w:val="21"/>
-          <w:lang w:eastAsia="zh-CN"/>
-        </w:rPr>
-        <w:t>英文推文谣言</w:t>
-      </w:r>
       <w:proofErr w:type="gramEnd"/>
-      <w:r>
-        <w:rPr>
-          <w:color w:val="000000"/>
-          <w:sz w:val="21"/>
-          <w:lang w:eastAsia="zh-CN"/>
-        </w:rPr>
-        <w:t>检测系统。系统以</w:t>
-      </w:r>
-      <w:r>
-        <w:rPr>
-          <w:color w:val="000000"/>
-          <w:sz w:val="21"/>
-          <w:lang w:eastAsia="zh-CN"/>
-        </w:rPr>
-        <w:t xml:space="preserve"> train.csv </w:t>
-      </w:r>
-      <w:r>
-        <w:rPr>
-          <w:color w:val="000000"/>
-          <w:sz w:val="21"/>
-          <w:lang w:eastAsia="zh-CN"/>
-        </w:rPr>
-        <w:t>为唯一训练来源，按</w:t>
-      </w:r>
-      <w:r>
-        <w:rPr>
-          <w:color w:val="000000"/>
-          <w:sz w:val="21"/>
-          <w:lang w:eastAsia="zh-CN"/>
-        </w:rPr>
-        <w:t xml:space="preserve"> 7 </w:t>
-      </w:r>
       <w:proofErr w:type="gramStart"/>
-      <w:r>
-        <w:rPr>
-          <w:color w:val="000000"/>
-          <w:sz w:val="21"/>
-          <w:lang w:eastAsia="zh-CN"/>
-        </w:rPr>
-        <w:t>个</w:t>
-      </w:r>
       <w:proofErr w:type="gramEnd"/>
-      <w:r>
-        <w:rPr>
-          <w:color w:val="000000"/>
-          <w:sz w:val="21"/>
-          <w:lang w:eastAsia="zh-CN"/>
-        </w:rPr>
-        <w:t>事件分别训练</w:t>
-      </w:r>
-      <w:r>
-        <w:rPr>
-          <w:color w:val="000000"/>
-          <w:sz w:val="21"/>
-          <w:lang w:eastAsia="zh-CN"/>
-        </w:rPr>
-        <w:t xml:space="preserve"> Twitter-</w:t>
-      </w:r>
       <w:proofErr w:type="spellStart"/>
-      <w:r>
-        <w:rPr>
-          <w:color w:val="000000"/>
-          <w:sz w:val="21"/>
-          <w:lang w:eastAsia="zh-CN"/>
-        </w:rPr>
-        <w:t>RoBERTa</w:t>
-      </w:r>
       <w:proofErr w:type="spellEnd"/>
-      <w:r>
-        <w:rPr>
-          <w:color w:val="000000"/>
-          <w:sz w:val="21"/>
-          <w:lang w:eastAsia="zh-CN"/>
-        </w:rPr>
-        <w:t xml:space="preserve"> </w:t>
-      </w:r>
-      <w:r>
-        <w:rPr>
-          <w:color w:val="000000"/>
-          <w:sz w:val="21"/>
-          <w:lang w:eastAsia="zh-CN"/>
-        </w:rPr>
-        <w:t>二分类器，并在验证集上搜索阈值与融合权重；推理阶段结合</w:t>
-      </w:r>
-      <w:r>
-        <w:rPr>
-          <w:color w:val="000000"/>
-          <w:sz w:val="21"/>
-          <w:lang w:eastAsia="zh-CN"/>
-        </w:rPr>
-        <w:t xml:space="preserve"> TF-IDF Logistic Regression</w:t>
-      </w:r>
-      <w:r>
-        <w:rPr>
-          <w:color w:val="000000"/>
-          <w:sz w:val="21"/>
-          <w:lang w:eastAsia="zh-CN"/>
-        </w:rPr>
-        <w:t>、相似案例检索和受约束中文解释，输出</w:t>
-      </w:r>
-      <w:r>
-        <w:rPr>
-          <w:color w:val="000000"/>
-          <w:sz w:val="21"/>
-          <w:lang w:eastAsia="zh-CN"/>
-        </w:rPr>
-        <w:t xml:space="preserve"> 0/1 </w:t>
-      </w:r>
-      <w:r>
-        <w:rPr>
-          <w:color w:val="000000"/>
-          <w:sz w:val="21"/>
-          <w:lang w:eastAsia="zh-CN"/>
-        </w:rPr>
-        <w:t>标签、置信度、相似样本和判断依据。</w:t>
-      </w:r>
-      <w:r>
-        <w:rPr>
-          <w:color w:val="000000"/>
-          <w:sz w:val="21"/>
-          <w:lang w:eastAsia="zh-CN"/>
-        </w:rPr>
-        <w:t xml:space="preserve">CLI </w:t>
-      </w:r>
-      <w:r>
-        <w:rPr>
-          <w:color w:val="000000"/>
-          <w:sz w:val="21"/>
-          <w:lang w:eastAsia="zh-CN"/>
-        </w:rPr>
-        <w:t>与</w:t>
-      </w:r>
-      <w:r>
-        <w:rPr>
-          <w:color w:val="000000"/>
-          <w:sz w:val="21"/>
-          <w:lang w:eastAsia="zh-CN"/>
-        </w:rPr>
-        <w:t xml:space="preserve"> WebUI </w:t>
-      </w:r>
-      <w:r>
-        <w:rPr>
-          <w:color w:val="000000"/>
-          <w:sz w:val="21"/>
-          <w:lang w:eastAsia="zh-CN"/>
-        </w:rPr>
-        <w:t>支持训练、预测、批量评测和课堂演示。</w:t>
-      </w:r>
     </w:p>
     <w:p>
       <w:pPr>
@@ -820,26 +668,10 @@
           <w:sz w:val="21"/>
           <w:lang w:eastAsia="zh-CN"/>
         </w:rPr>
-        <w:t>课程要求模型输入一条推文，输出二分类结果并给出文字依据，同时要求模型可运行、有一定泛化能力且运行时间合理。</w:t>
+        <w:t>针对推文短、噪声多及事件分布不均的问题，系统将分类、检索、解释分离：分类器输出标签与概率，相似案例提供可追溯参考，LLM 仅整理依据，不参与分类。</w:t>
       </w:r>
       <w:proofErr w:type="gramStart"/>
-      <w:r>
-        <w:rPr>
-          <w:color w:val="000000"/>
-          <w:sz w:val="21"/>
-          <w:lang w:eastAsia="zh-CN"/>
-        </w:rPr>
-        <w:t>针对推文文本</w:t>
-      </w:r>
       <w:proofErr w:type="gramEnd"/>
-      <w:r>
-        <w:rPr>
-          <w:color w:val="000000"/>
-          <w:sz w:val="21"/>
-          <w:lang w:eastAsia="zh-CN"/>
-        </w:rPr>
-        <w:t>短、噪声多和事件分布不均的特点，本系统把检测、检索、解释分开：分类器只决定标签和概率；相似案例用于提供可追溯参考；大语言模型只整理解释，不参与最终分类。</w:t>
-      </w:r>
     </w:p>
     <w:tbl>
       <w:tblPr>
@@ -1618,258 +1450,10 @@
           <w:sz w:val="21"/>
           <w:lang w:eastAsia="zh-CN"/>
         </w:rPr>
-        <w:t>数据集字段严格为</w:t>
-      </w:r>
-      <w:r>
-        <w:rPr>
-          <w:color w:val="000000"/>
-          <w:sz w:val="21"/>
-          <w:lang w:eastAsia="zh-CN"/>
-        </w:rPr>
-        <w:t xml:space="preserve"> id</w:t>
-      </w:r>
-      <w:r>
-        <w:rPr>
-          <w:color w:val="000000"/>
-          <w:sz w:val="21"/>
-          <w:lang w:eastAsia="zh-CN"/>
-        </w:rPr>
-        <w:t>、</w:t>
-      </w:r>
-      <w:r>
-        <w:rPr>
-          <w:color w:val="000000"/>
-          <w:sz w:val="21"/>
-          <w:lang w:eastAsia="zh-CN"/>
-        </w:rPr>
-        <w:t>text</w:t>
-      </w:r>
-      <w:r>
-        <w:rPr>
-          <w:color w:val="000000"/>
-          <w:sz w:val="21"/>
-          <w:lang w:eastAsia="zh-CN"/>
-        </w:rPr>
-        <w:t>、</w:t>
-      </w:r>
-      <w:r>
-        <w:rPr>
-          <w:color w:val="000000"/>
-          <w:sz w:val="21"/>
-          <w:lang w:eastAsia="zh-CN"/>
-        </w:rPr>
-        <w:t>label</w:t>
-      </w:r>
-      <w:r>
-        <w:rPr>
-          <w:color w:val="000000"/>
-          <w:sz w:val="21"/>
-          <w:lang w:eastAsia="zh-CN"/>
-        </w:rPr>
-        <w:t>、</w:t>
-      </w:r>
-      <w:r>
-        <w:rPr>
-          <w:color w:val="000000"/>
-          <w:sz w:val="21"/>
-          <w:lang w:eastAsia="zh-CN"/>
-        </w:rPr>
-        <w:t>event</w:t>
-      </w:r>
-      <w:r>
-        <w:rPr>
-          <w:color w:val="000000"/>
-          <w:sz w:val="21"/>
-          <w:lang w:eastAsia="zh-CN"/>
-        </w:rPr>
-        <w:t>。核验结果显示：</w:t>
-      </w:r>
-      <w:r>
-        <w:rPr>
-          <w:color w:val="000000"/>
-          <w:sz w:val="21"/>
-          <w:lang w:eastAsia="zh-CN"/>
-        </w:rPr>
-        <w:t xml:space="preserve">train.csv </w:t>
-      </w:r>
-      <w:r>
-        <w:rPr>
-          <w:color w:val="000000"/>
-          <w:sz w:val="21"/>
-          <w:lang w:eastAsia="zh-CN"/>
-        </w:rPr>
-        <w:t>共</w:t>
-      </w:r>
-      <w:r>
-        <w:rPr>
-          <w:color w:val="000000"/>
-          <w:sz w:val="21"/>
-          <w:lang w:eastAsia="zh-CN"/>
-        </w:rPr>
-        <w:t xml:space="preserve"> 2840 </w:t>
-      </w:r>
-      <w:r>
-        <w:rPr>
-          <w:color w:val="000000"/>
-          <w:sz w:val="21"/>
-          <w:lang w:eastAsia="zh-CN"/>
-        </w:rPr>
-        <w:t>条，标签</w:t>
-      </w:r>
-      <w:r>
-        <w:rPr>
-          <w:color w:val="000000"/>
-          <w:sz w:val="21"/>
-          <w:lang w:eastAsia="zh-CN"/>
-        </w:rPr>
-        <w:t xml:space="preserve"> 0/1 </w:t>
-      </w:r>
-      <w:r>
-        <w:rPr>
-          <w:color w:val="000000"/>
-          <w:sz w:val="21"/>
-          <w:lang w:eastAsia="zh-CN"/>
-        </w:rPr>
-        <w:t>分别为</w:t>
-      </w:r>
-      <w:r>
-        <w:rPr>
-          <w:color w:val="000000"/>
-          <w:sz w:val="21"/>
-          <w:lang w:eastAsia="zh-CN"/>
-        </w:rPr>
-        <w:t xml:space="preserve"> 1600/1240</w:t>
-      </w:r>
-      <w:r>
-        <w:rPr>
-          <w:color w:val="000000"/>
-          <w:sz w:val="21"/>
-          <w:lang w:eastAsia="zh-CN"/>
-        </w:rPr>
-        <w:t>；</w:t>
-      </w:r>
-      <w:r>
-        <w:rPr>
-          <w:color w:val="000000"/>
-          <w:sz w:val="21"/>
-          <w:lang w:eastAsia="zh-CN"/>
-        </w:rPr>
-        <w:t xml:space="preserve">val.csv </w:t>
-      </w:r>
-      <w:r>
-        <w:rPr>
-          <w:color w:val="000000"/>
-          <w:sz w:val="21"/>
-          <w:lang w:eastAsia="zh-CN"/>
-        </w:rPr>
-        <w:t>共</w:t>
-      </w:r>
-      <w:r>
-        <w:rPr>
-          <w:color w:val="000000"/>
-          <w:sz w:val="21"/>
-          <w:lang w:eastAsia="zh-CN"/>
-        </w:rPr>
-        <w:t xml:space="preserve"> 401 </w:t>
-      </w:r>
-      <w:r>
-        <w:rPr>
-          <w:color w:val="000000"/>
-          <w:sz w:val="21"/>
-          <w:lang w:eastAsia="zh-CN"/>
-        </w:rPr>
-        <w:t>条，标签</w:t>
-      </w:r>
-      <w:r>
-        <w:rPr>
-          <w:color w:val="000000"/>
-          <w:sz w:val="21"/>
-          <w:lang w:eastAsia="zh-CN"/>
-        </w:rPr>
-        <w:t xml:space="preserve"> 0/1 </w:t>
-      </w:r>
-      <w:r>
-        <w:rPr>
-          <w:color w:val="000000"/>
-          <w:sz w:val="21"/>
-          <w:lang w:eastAsia="zh-CN"/>
-        </w:rPr>
-        <w:t>分别为</w:t>
-      </w:r>
-      <w:r>
-        <w:rPr>
-          <w:color w:val="000000"/>
-          <w:sz w:val="21"/>
-          <w:lang w:eastAsia="zh-CN"/>
-        </w:rPr>
-        <w:t xml:space="preserve"> 226/175</w:t>
-      </w:r>
-      <w:r>
-        <w:rPr>
-          <w:color w:val="000000"/>
-          <w:sz w:val="21"/>
-          <w:lang w:eastAsia="zh-CN"/>
-        </w:rPr>
-        <w:t>。两份文件均无缺失字段，训练集原始</w:t>
-      </w:r>
-      <w:r>
-        <w:rPr>
-          <w:color w:val="000000"/>
-          <w:sz w:val="21"/>
-          <w:lang w:eastAsia="zh-CN"/>
-        </w:rPr>
-        <w:t xml:space="preserve"> text </w:t>
-      </w:r>
-      <w:r>
-        <w:rPr>
-          <w:color w:val="000000"/>
-          <w:sz w:val="21"/>
-          <w:lang w:eastAsia="zh-CN"/>
-        </w:rPr>
-        <w:t>重复</w:t>
-      </w:r>
-      <w:r>
-        <w:rPr>
-          <w:color w:val="000000"/>
-          <w:sz w:val="21"/>
-          <w:lang w:eastAsia="zh-CN"/>
-        </w:rPr>
-        <w:t xml:space="preserve"> 7 </w:t>
-      </w:r>
-      <w:r>
-        <w:rPr>
-          <w:color w:val="000000"/>
-          <w:sz w:val="21"/>
-          <w:lang w:eastAsia="zh-CN"/>
-        </w:rPr>
-        <w:t>条，</w:t>
+        <w:t>数据字段为 id、text、label、event。train.csv 含 2840 条，标签 0/1 为 1600/1240；val.csv 含 401 条，标签 0/1 为 226/175。字段均完整；训练集有 7 条重复文本，验证集无重复。</w:t>
       </w:r>
       <w:proofErr w:type="gramStart"/>
-      <w:r>
-        <w:rPr>
-          <w:color w:val="000000"/>
-          <w:sz w:val="21"/>
-          <w:lang w:eastAsia="zh-CN"/>
-        </w:rPr>
-        <w:t>验证集无</w:t>
-      </w:r>
       <w:proofErr w:type="gramEnd"/>
-      <w:r>
-        <w:rPr>
-          <w:color w:val="000000"/>
-          <w:sz w:val="21"/>
-          <w:lang w:eastAsia="zh-CN"/>
-        </w:rPr>
-        <w:t xml:space="preserve"> text </w:t>
-      </w:r>
-      <w:r>
-        <w:rPr>
-          <w:color w:val="000000"/>
-          <w:sz w:val="21"/>
-          <w:lang w:eastAsia="zh-CN"/>
-        </w:rPr>
-        <w:t>重复。</w:t>
-      </w:r>
     </w:p>
     <w:tbl>
       <w:tblPr>
@@ -2437,251 +2021,15 @@
           <w:color w:val="000000"/>
           <w:sz w:val="21"/>
         </w:rPr>
-        <w:t>训练配置见</w:t>
+        <w:t>训练采用 max_length=128、batch size=8、epochs=8、learning rate=2e-5，并使用类别权重、label smoothing、dropout、梯度裁剪与混合精度。事件内数据按 90%/10% 划分，官方 val.csv 用于阈值、融合权重搜索和最终评测。</w:t>
       </w:r>
       <w:proofErr w:type="spellEnd"/>
-      <w:r>
-        <w:rPr>
-          <w:color w:val="000000"/>
-          <w:sz w:val="21"/>
-        </w:rPr>
-        <w:t xml:space="preserve"> configs/</w:t>
-      </w:r>
       <w:proofErr w:type="spellStart"/>
-      <w:r>
-        <w:rPr>
-          <w:color w:val="000000"/>
-          <w:sz w:val="21"/>
-        </w:rPr>
-        <w:t>default.yaml</w:t>
-      </w:r>
-      <w:r>
-        <w:rPr>
-          <w:color w:val="000000"/>
-          <w:sz w:val="21"/>
-        </w:rPr>
-        <w:t>：</w:t>
-      </w:r>
-      <w:r>
-        <w:rPr>
-          <w:color w:val="000000"/>
-          <w:sz w:val="21"/>
-        </w:rPr>
-        <w:t>seed</w:t>
-      </w:r>
       <w:proofErr w:type="spellEnd"/>
-      <w:r>
-        <w:rPr>
-          <w:color w:val="000000"/>
-          <w:sz w:val="21"/>
-        </w:rPr>
-        <w:t>=42</w:t>
-      </w:r>
-      <w:r>
-        <w:rPr>
-          <w:color w:val="000000"/>
-          <w:sz w:val="21"/>
-        </w:rPr>
-        <w:t>，</w:t>
-      </w:r>
-      <w:r>
-        <w:rPr>
-          <w:color w:val="000000"/>
-          <w:sz w:val="21"/>
-        </w:rPr>
-        <w:t>max_length=128</w:t>
-      </w:r>
-      <w:r>
-        <w:rPr>
-          <w:color w:val="000000"/>
-          <w:sz w:val="21"/>
-        </w:rPr>
-        <w:t>，</w:t>
-      </w:r>
-      <w:r>
-        <w:rPr>
-          <w:color w:val="000000"/>
-          <w:sz w:val="21"/>
-        </w:rPr>
-        <w:t>batch size=8</w:t>
-      </w:r>
-      <w:r>
-        <w:rPr>
-          <w:color w:val="000000"/>
-          <w:sz w:val="21"/>
-        </w:rPr>
-        <w:t>，</w:t>
-      </w:r>
-      <w:r>
-        <w:rPr>
-          <w:color w:val="000000"/>
-          <w:sz w:val="21"/>
-        </w:rPr>
-        <w:t>epochs=8</w:t>
-      </w:r>
-      <w:r>
-        <w:rPr>
-          <w:color w:val="000000"/>
-          <w:sz w:val="21"/>
-        </w:rPr>
-        <w:t>，</w:t>
-      </w:r>
-      <w:r>
-        <w:rPr>
-          <w:color w:val="000000"/>
-          <w:sz w:val="21"/>
-        </w:rPr>
-        <w:t>learning rate=2e-5</w:t>
-      </w:r>
-      <w:r>
-        <w:rPr>
-          <w:color w:val="000000"/>
-          <w:sz w:val="21"/>
-        </w:rPr>
-        <w:t>，</w:t>
-      </w:r>
-      <w:r>
-        <w:rPr>
-          <w:color w:val="000000"/>
-          <w:sz w:val="21"/>
-        </w:rPr>
-        <w:t>head learning rate=5e-5</w:t>
-      </w:r>
-      <w:r>
-        <w:rPr>
-          <w:color w:val="000000"/>
-          <w:sz w:val="21"/>
-        </w:rPr>
-        <w:t>，</w:t>
-      </w:r>
-      <w:r>
-        <w:rPr>
-          <w:color w:val="000000"/>
-          <w:sz w:val="21"/>
-        </w:rPr>
-        <w:t>weight decay=0.01</w:t>
-      </w:r>
-      <w:r>
-        <w:rPr>
-          <w:color w:val="000000"/>
-          <w:sz w:val="21"/>
-        </w:rPr>
-        <w:t>；训练中使用</w:t>
-      </w:r>
-      <w:r>
-        <w:rPr>
-          <w:color w:val="000000"/>
-          <w:sz w:val="21"/>
-        </w:rPr>
-        <w:t xml:space="preserve"> class </w:t>
-      </w:r>
       <w:proofErr w:type="spellStart"/>
-      <w:r>
-        <w:rPr>
-          <w:color w:val="000000"/>
-          <w:sz w:val="21"/>
-        </w:rPr>
-        <w:t>weight</w:t>
-      </w:r>
-      <w:r>
-        <w:rPr>
-          <w:color w:val="000000"/>
-          <w:sz w:val="21"/>
-        </w:rPr>
-        <w:t>、</w:t>
-      </w:r>
-      <w:r>
-        <w:rPr>
-          <w:color w:val="000000"/>
-          <w:sz w:val="21"/>
-        </w:rPr>
-        <w:t>label</w:t>
-      </w:r>
       <w:proofErr w:type="spellEnd"/>
-      <w:r>
-        <w:rPr>
-          <w:color w:val="000000"/>
-          <w:sz w:val="21"/>
-        </w:rPr>
-        <w:t xml:space="preserve"> </w:t>
-      </w:r>
       <w:proofErr w:type="spellStart"/>
-      <w:r>
-        <w:rPr>
-          <w:color w:val="000000"/>
-          <w:sz w:val="21"/>
-        </w:rPr>
-        <w:t>smoothing</w:t>
-      </w:r>
-      <w:r>
-        <w:rPr>
-          <w:color w:val="000000"/>
-          <w:sz w:val="21"/>
-        </w:rPr>
-        <w:t>、</w:t>
-      </w:r>
-      <w:r>
-        <w:rPr>
-          <w:color w:val="000000"/>
-          <w:sz w:val="21"/>
-        </w:rPr>
-        <w:t>dropout</w:t>
-      </w:r>
-      <w:r>
-        <w:rPr>
-          <w:color w:val="000000"/>
-          <w:sz w:val="21"/>
-        </w:rPr>
-        <w:t>、梯度裁剪、梯度累积和混合精度</w:t>
-      </w:r>
       <w:proofErr w:type="spellEnd"/>
-      <w:r>
-        <w:rPr>
-          <w:color w:val="000000"/>
-          <w:sz w:val="21"/>
-        </w:rPr>
-        <w:t>。</w:t>
-      </w:r>
-      <w:r>
-        <w:rPr>
-          <w:color w:val="000000"/>
-          <w:sz w:val="21"/>
-          <w:lang w:eastAsia="zh-CN"/>
-        </w:rPr>
-        <w:t>每个事件内部按</w:t>
-      </w:r>
-      <w:r>
-        <w:rPr>
-          <w:color w:val="000000"/>
-          <w:sz w:val="21"/>
-          <w:lang w:eastAsia="zh-CN"/>
-        </w:rPr>
-        <w:t xml:space="preserve"> 90%/10% </w:t>
-      </w:r>
-      <w:r>
-        <w:rPr>
-          <w:color w:val="000000"/>
-          <w:sz w:val="21"/>
-          <w:lang w:eastAsia="zh-CN"/>
-        </w:rPr>
-        <w:t>划分训练与内部验证，官方</w:t>
-      </w:r>
-      <w:r>
-        <w:rPr>
-          <w:color w:val="000000"/>
-          <w:sz w:val="21"/>
-          <w:lang w:eastAsia="zh-CN"/>
-        </w:rPr>
-        <w:t xml:space="preserve"> val.csv </w:t>
-      </w:r>
-      <w:r>
-        <w:rPr>
-          <w:color w:val="000000"/>
-          <w:sz w:val="21"/>
-          <w:lang w:eastAsia="zh-CN"/>
-        </w:rPr>
-        <w:t>用于阈值、融合权重搜索和最终评测。</w:t>
-      </w:r>
     </w:p>
     <w:p>
       <w:pPr>
@@ -2727,106 +2075,10 @@
           <w:sz w:val="21"/>
           <w:lang w:eastAsia="zh-CN"/>
         </w:rPr>
-        <w:t>项目采用模块化结构，核心流程由数据读取、清洗、模型训练、预测评估、解释生成和</w:t>
-      </w:r>
-      <w:r>
-        <w:rPr>
-          <w:color w:val="000000"/>
-          <w:sz w:val="21"/>
-          <w:lang w:eastAsia="zh-CN"/>
-        </w:rPr>
-        <w:t xml:space="preserve"> WebUI </w:t>
-      </w:r>
-      <w:r>
-        <w:rPr>
-          <w:color w:val="000000"/>
-          <w:sz w:val="21"/>
-          <w:lang w:eastAsia="zh-CN"/>
-        </w:rPr>
-        <w:t>展示组成。</w:t>
-      </w:r>
-      <w:r>
-        <w:rPr>
-          <w:color w:val="000000"/>
-          <w:sz w:val="21"/>
-          <w:lang w:eastAsia="zh-CN"/>
-        </w:rPr>
-        <w:t xml:space="preserve">src/pipeline.py </w:t>
-      </w:r>
-      <w:r>
-        <w:rPr>
-          <w:color w:val="000000"/>
-          <w:sz w:val="21"/>
-          <w:lang w:eastAsia="zh-CN"/>
-        </w:rPr>
-        <w:t>将分类器、检索器和解释器统一编排，避免界面层直接耦合模型细节；</w:t>
-      </w:r>
-      <w:r>
-        <w:rPr>
-          <w:color w:val="000000"/>
-          <w:sz w:val="21"/>
-          <w:lang w:eastAsia="zh-CN"/>
-        </w:rPr>
-        <w:t xml:space="preserve">src/models/transformer.py </w:t>
-      </w:r>
-      <w:r>
-        <w:rPr>
-          <w:color w:val="000000"/>
-          <w:sz w:val="21"/>
-          <w:lang w:eastAsia="zh-CN"/>
-        </w:rPr>
-        <w:t>负责加载</w:t>
+        <w:t>核心模块职责明确：src/pipeline.py 编排分类、检索和解释；src/models/transformer.py 加载分事件模型、阈值并输出概率；src/training/trainer.py 完成训练、验证和 checkpoint 保存。</w:t>
       </w:r>
       <w:proofErr w:type="gramStart"/>
-      <w:r>
-        <w:rPr>
-          <w:color w:val="000000"/>
-          <w:sz w:val="21"/>
-          <w:lang w:eastAsia="zh-CN"/>
-        </w:rPr>
-        <w:t>分事件</w:t>
-      </w:r>
       <w:proofErr w:type="gramEnd"/>
-      <w:r>
-        <w:rPr>
-          <w:color w:val="000000"/>
-          <w:sz w:val="21"/>
-          <w:lang w:eastAsia="zh-CN"/>
-        </w:rPr>
-        <w:t>模型、读取阈值元数据并输出概率；</w:t>
-      </w:r>
-      <w:r>
-        <w:rPr>
-          <w:color w:val="000000"/>
-          <w:sz w:val="21"/>
-          <w:lang w:eastAsia="zh-CN"/>
-        </w:rPr>
-        <w:t xml:space="preserve">src/training/trainer.py </w:t>
-      </w:r>
-      <w:r>
-        <w:rPr>
-          <w:color w:val="000000"/>
-          <w:sz w:val="21"/>
-          <w:lang w:eastAsia="zh-CN"/>
-        </w:rPr>
-        <w:t>负责训练、验证和</w:t>
-      </w:r>
-      <w:r>
-        <w:rPr>
-          <w:color w:val="000000"/>
-          <w:sz w:val="21"/>
-          <w:lang w:eastAsia="zh-CN"/>
-        </w:rPr>
-        <w:t xml:space="preserve"> checkpoint </w:t>
-      </w:r>
-      <w:r>
-        <w:rPr>
-          <w:color w:val="000000"/>
-          <w:sz w:val="21"/>
-          <w:lang w:eastAsia="zh-CN"/>
-        </w:rPr>
-        <w:t>保存。</w:t>
-      </w:r>
     </w:p>
     <w:tbl>
       <w:tblPr>
@@ -3578,200 +2830,18 @@
           <w:color w:val="000000"/>
           <w:sz w:val="21"/>
         </w:rPr>
-        <w:t xml:space="preserve">README </w:t>
+        <w:t>批量评测处理 400 条样本，分类耗时 1869.2 ms；Accuracy 90.00%、Precision 89.88%、Recall 86.78%、F1 88.30%，混淆矩阵为 TN=209、FP=17、FN=23、TP=151。</w:t>
       </w:r>
       <w:proofErr w:type="spellStart"/>
-      <w:r>
-        <w:rPr>
-          <w:color w:val="000000"/>
-          <w:sz w:val="21"/>
-        </w:rPr>
-        <w:t>中的</w:t>
-      </w:r>
       <w:proofErr w:type="spellEnd"/>
-      <w:r>
-        <w:rPr>
-          <w:color w:val="000000"/>
-          <w:sz w:val="21"/>
-        </w:rPr>
-        <w:t xml:space="preserve"> WebUI </w:t>
-      </w:r>
       <w:proofErr w:type="spellStart"/>
-      <w:r>
-        <w:rPr>
-          <w:color w:val="000000"/>
-          <w:sz w:val="21"/>
-        </w:rPr>
-        <w:t>评测截图显示，本次批量评测处理</w:t>
-      </w:r>
       <w:proofErr w:type="spellEnd"/>
-      <w:r>
-        <w:rPr>
-          <w:color w:val="000000"/>
-          <w:sz w:val="21"/>
-        </w:rPr>
-        <w:t xml:space="preserve"> 400 </w:t>
-      </w:r>
       <w:proofErr w:type="spellStart"/>
-      <w:r>
-        <w:rPr>
-          <w:color w:val="000000"/>
-          <w:sz w:val="21"/>
-        </w:rPr>
-        <w:t>条样本，分类耗时</w:t>
-      </w:r>
       <w:proofErr w:type="spellEnd"/>
-      <w:r>
-        <w:rPr>
-          <w:color w:val="000000"/>
-          <w:sz w:val="21"/>
-        </w:rPr>
-        <w:t xml:space="preserve"> 1869.2 </w:t>
-      </w:r>
       <w:proofErr w:type="spellStart"/>
-      <w:r>
-        <w:rPr>
-          <w:color w:val="000000"/>
-          <w:sz w:val="21"/>
-        </w:rPr>
-        <w:t>ms</w:t>
-      </w:r>
-      <w:r>
-        <w:rPr>
-          <w:color w:val="000000"/>
-          <w:sz w:val="21"/>
-        </w:rPr>
-        <w:t>；</w:t>
-      </w:r>
-      <w:r>
-        <w:rPr>
-          <w:color w:val="000000"/>
-          <w:sz w:val="21"/>
-        </w:rPr>
-        <w:t>Accuracy</w:t>
-      </w:r>
       <w:proofErr w:type="spellEnd"/>
-      <w:r>
-        <w:rPr>
-          <w:color w:val="000000"/>
-          <w:sz w:val="21"/>
-        </w:rPr>
-        <w:t xml:space="preserve"> 90.00%</w:t>
-      </w:r>
-      <w:r>
-        <w:rPr>
-          <w:color w:val="000000"/>
-          <w:sz w:val="21"/>
-        </w:rPr>
-        <w:t>、</w:t>
-      </w:r>
-      <w:r>
-        <w:rPr>
-          <w:color w:val="000000"/>
-          <w:sz w:val="21"/>
-        </w:rPr>
-        <w:t>Precision 89.88%</w:t>
-      </w:r>
-      <w:r>
-        <w:rPr>
-          <w:color w:val="000000"/>
-          <w:sz w:val="21"/>
-        </w:rPr>
-        <w:t>、</w:t>
-      </w:r>
-      <w:r>
-        <w:rPr>
-          <w:color w:val="000000"/>
-          <w:sz w:val="21"/>
-        </w:rPr>
-        <w:t>Recall 86.78%</w:t>
-      </w:r>
-      <w:r>
-        <w:rPr>
-          <w:color w:val="000000"/>
-          <w:sz w:val="21"/>
-        </w:rPr>
-        <w:t>、</w:t>
-      </w:r>
-      <w:r>
-        <w:rPr>
-          <w:color w:val="000000"/>
-          <w:sz w:val="21"/>
-        </w:rPr>
-        <w:t>F1 88.30%</w:t>
-      </w:r>
-      <w:r>
-        <w:rPr>
-          <w:color w:val="000000"/>
-          <w:sz w:val="21"/>
-        </w:rPr>
-        <w:t>，</w:t>
-      </w:r>
       <w:proofErr w:type="spellStart"/>
-      <w:r>
-        <w:rPr>
-          <w:color w:val="000000"/>
-          <w:sz w:val="21"/>
-        </w:rPr>
-        <w:t>混淆矩阵为</w:t>
-      </w:r>
       <w:proofErr w:type="spellEnd"/>
-      <w:r>
-        <w:rPr>
-          <w:color w:val="000000"/>
-          <w:sz w:val="21"/>
-        </w:rPr>
-        <w:t xml:space="preserve"> TN=209</w:t>
-      </w:r>
-      <w:r>
-        <w:rPr>
-          <w:color w:val="000000"/>
-          <w:sz w:val="21"/>
-        </w:rPr>
-        <w:t>、</w:t>
-      </w:r>
-      <w:r>
-        <w:rPr>
-          <w:color w:val="000000"/>
-          <w:sz w:val="21"/>
-        </w:rPr>
-        <w:t>FP=17</w:t>
-      </w:r>
-      <w:r>
-        <w:rPr>
-          <w:color w:val="000000"/>
-          <w:sz w:val="21"/>
-        </w:rPr>
-        <w:t>、</w:t>
-      </w:r>
-      <w:r>
-        <w:rPr>
-          <w:color w:val="000000"/>
-          <w:sz w:val="21"/>
-        </w:rPr>
-        <w:t>FN=23</w:t>
-      </w:r>
-      <w:r>
-        <w:rPr>
-          <w:color w:val="000000"/>
-          <w:sz w:val="21"/>
-        </w:rPr>
-        <w:t>、</w:t>
-      </w:r>
-      <w:r>
-        <w:rPr>
-          <w:color w:val="000000"/>
-          <w:sz w:val="21"/>
-        </w:rPr>
-        <w:t>TP=151</w:t>
-      </w:r>
-      <w:r>
-        <w:rPr>
-          <w:color w:val="000000"/>
-          <w:sz w:val="21"/>
-        </w:rPr>
-        <w:t>。</w:t>
-      </w:r>
     </w:p>
     <w:tbl>
       <w:tblPr>
@@ -4332,7 +3402,7 @@
           <w:sz w:val="21"/>
           <w:lang w:eastAsia="zh-CN"/>
         </w:rPr>
-        <w:t>批量评测结果说明：Accuracy 为 90.00%、F1 为 88.30%，表明模型在验证集上保持了较好的综合判别能力；Precision 为 89.88%、Recall 为 86.78%。混淆矩阵中 FP=17、FN=23，漏判数量高于误报数量，说明模型对“谣言”类别的判断相对谨慎。</w:t>
+        <w:t>结果分析：Accuracy 与 F1 表明模型具有较好的综合判别能力；FN=23 高于 FP=17，说明模型对“谣言”预测相对谨慎，漏判多于误报。</w:t>
       </w:r>
     </w:p>
     <w:p>
@@ -4440,164 +3510,12 @@
           <w:sz w:val="21"/>
           <w:lang w:eastAsia="zh-CN"/>
         </w:rPr>
-        <w:t>该样例</w:t>
+        <w:t>该样例 ID 为 500364250461003777，属于事件 1（Ferguson 与 Michael Brown），真实标签 label=1（谣言）。</w:t>
       </w:r>
       <w:proofErr w:type="gramStart"/>
-      <w:r>
-        <w:rPr>
-          <w:color w:val="000000"/>
-          <w:sz w:val="21"/>
-          <w:lang w:eastAsia="zh-CN"/>
-        </w:rPr>
-        <w:t>的推文</w:t>
-      </w:r>
       <w:proofErr w:type="gramEnd"/>
-      <w:r>
-        <w:rPr>
-          <w:color w:val="000000"/>
-          <w:sz w:val="21"/>
-          <w:lang w:eastAsia="zh-CN"/>
-        </w:rPr>
-        <w:t xml:space="preserve"> ID </w:t>
-      </w:r>
-      <w:r>
-        <w:rPr>
-          <w:color w:val="000000"/>
-          <w:sz w:val="21"/>
-          <w:lang w:eastAsia="zh-CN"/>
-        </w:rPr>
-        <w:t>为</w:t>
-      </w:r>
-      <w:r>
-        <w:rPr>
-          <w:color w:val="000000"/>
-          <w:sz w:val="21"/>
-          <w:lang w:eastAsia="zh-CN"/>
-        </w:rPr>
-        <w:t xml:space="preserve"> 500364250461003777</w:t>
-      </w:r>
-      <w:r>
-        <w:rPr>
-          <w:color w:val="000000"/>
-          <w:sz w:val="21"/>
-          <w:lang w:eastAsia="zh-CN"/>
-        </w:rPr>
-        <w:t>，属于事件</w:t>
-      </w:r>
-      <w:r>
-        <w:rPr>
-          <w:color w:val="000000"/>
-          <w:sz w:val="21"/>
-          <w:lang w:eastAsia="zh-CN"/>
-        </w:rPr>
-        <w:t xml:space="preserve"> 1</w:t>
-      </w:r>
-      <w:r>
-        <w:rPr>
-          <w:color w:val="000000"/>
-          <w:sz w:val="21"/>
-          <w:lang w:eastAsia="zh-CN"/>
-        </w:rPr>
-        <w:t>（</w:t>
-      </w:r>
-      <w:r>
-        <w:rPr>
-          <w:color w:val="000000"/>
-          <w:sz w:val="21"/>
-          <w:lang w:eastAsia="zh-CN"/>
-        </w:rPr>
-        <w:t xml:space="preserve">Ferguson </w:t>
-      </w:r>
-      <w:r>
-        <w:rPr>
-          <w:color w:val="000000"/>
-          <w:sz w:val="21"/>
-          <w:lang w:eastAsia="zh-CN"/>
-        </w:rPr>
-        <w:t>与</w:t>
-      </w:r>
-      <w:r>
-        <w:rPr>
-          <w:color w:val="000000"/>
-          <w:sz w:val="21"/>
-          <w:lang w:eastAsia="zh-CN"/>
-        </w:rPr>
-        <w:t xml:space="preserve"> Michael Brown </w:t>
-      </w:r>
-      <w:r>
-        <w:rPr>
-          <w:color w:val="000000"/>
-          <w:sz w:val="21"/>
-          <w:lang w:eastAsia="zh-CN"/>
-        </w:rPr>
-        <w:t>事件），真实标签</w:t>
-      </w:r>
-      <w:r>
-        <w:rPr>
-          <w:color w:val="000000"/>
-          <w:sz w:val="21"/>
-          <w:lang w:eastAsia="zh-CN"/>
-        </w:rPr>
-        <w:t xml:space="preserve"> label=1</w:t>
-      </w:r>
-      <w:r>
-        <w:rPr>
-          <w:color w:val="000000"/>
-          <w:sz w:val="21"/>
-          <w:lang w:eastAsia="zh-CN"/>
-        </w:rPr>
-        <w:t>，即谣言。图</w:t>
-      </w:r>
-      <w:r>
-        <w:rPr>
-          <w:color w:val="000000"/>
-          <w:sz w:val="21"/>
-          <w:lang w:eastAsia="zh-CN"/>
-        </w:rPr>
-        <w:t>4</w:t>
-      </w:r>
-      <w:r>
-        <w:rPr>
-          <w:color w:val="000000"/>
-          <w:sz w:val="21"/>
-          <w:lang w:eastAsia="zh-CN"/>
-        </w:rPr>
-        <w:t>显示系统预测为谣言，置信度为</w:t>
-      </w:r>
-      <w:r>
-        <w:rPr>
-          <w:color w:val="000000"/>
-          <w:sz w:val="21"/>
-          <w:lang w:eastAsia="zh-CN"/>
-        </w:rPr>
-        <w:t xml:space="preserve"> 94.75%</w:t>
-      </w:r>
-      <w:r>
-        <w:rPr>
-          <w:color w:val="000000"/>
-          <w:sz w:val="21"/>
-          <w:lang w:eastAsia="zh-CN"/>
-        </w:rPr>
-        <w:t>，与数据</w:t>
-      </w:r>
       <w:proofErr w:type="gramStart"/>
-      <w:r>
-        <w:rPr>
-          <w:color w:val="000000"/>
-          <w:sz w:val="21"/>
-          <w:lang w:eastAsia="zh-CN"/>
-        </w:rPr>
-        <w:t>集真实</w:t>
-      </w:r>
       <w:proofErr w:type="gramEnd"/>
-      <w:r>
-        <w:rPr>
-          <w:color w:val="000000"/>
-          <w:sz w:val="21"/>
-          <w:lang w:eastAsia="zh-CN"/>
-        </w:rPr>
-        <w:t>标签一致。</w:t>
-      </w:r>
     </w:p>
     <w:p>
       <w:pPr>
@@ -4705,7 +3623,7 @@
           <w:sz w:val="21"/>
           <w:lang w:eastAsia="zh-CN"/>
         </w:rPr>
-        <w:t>单条检测结果说明：系统将该 event=1 样例判定为谣言，谣言概率为 94.75%，非谣言概率为 5.25%，预测结果与 val.csv 中的真实标签 label=1 一致。这里的置信度表示分类模型在两个类别之间的相对判断强度，不等同于外部事实核查结论。</w:t>
+        <w:t>图4中系统预测为谣言，谣言概率 94.75%、非谣言概率 5.25%，与真实标签一致。置信度仅表示模型的相对判断强度，不代表外部事实核查结论。</w:t>
       </w:r>
     </w:p>
     <w:p>
@@ -4753,156 +3671,12 @@
           <w:sz w:val="21"/>
           <w:lang w:eastAsia="zh-CN"/>
         </w:rPr>
-        <w:t>图</w:t>
-      </w:r>
-      <w:r>
-        <w:rPr>
-          <w:color w:val="000000"/>
-          <w:sz w:val="21"/>
-          <w:lang w:eastAsia="zh-CN"/>
-        </w:rPr>
-        <w:t>5</w:t>
-      </w:r>
-      <w:r>
-        <w:rPr>
-          <w:color w:val="000000"/>
-          <w:sz w:val="21"/>
-          <w:lang w:eastAsia="zh-CN"/>
-        </w:rPr>
-        <w:t>和图</w:t>
-      </w:r>
-      <w:r>
-        <w:rPr>
-          <w:color w:val="000000"/>
-          <w:sz w:val="21"/>
-          <w:lang w:eastAsia="zh-CN"/>
-        </w:rPr>
-        <w:t>6</w:t>
-      </w:r>
-      <w:r>
-        <w:rPr>
-          <w:color w:val="000000"/>
-          <w:sz w:val="21"/>
-          <w:lang w:eastAsia="zh-CN"/>
-        </w:rPr>
-        <w:t>继续针对上述</w:t>
-      </w:r>
-      <w:r>
-        <w:rPr>
-          <w:color w:val="000000"/>
-          <w:sz w:val="21"/>
-          <w:lang w:eastAsia="zh-CN"/>
-        </w:rPr>
-        <w:t xml:space="preserve"> event=1</w:t>
-      </w:r>
-      <w:r>
-        <w:rPr>
-          <w:color w:val="000000"/>
-          <w:sz w:val="21"/>
-          <w:lang w:eastAsia="zh-CN"/>
-        </w:rPr>
-        <w:t>、</w:t>
-      </w:r>
-      <w:r>
-        <w:rPr>
-          <w:color w:val="000000"/>
-          <w:sz w:val="21"/>
-          <w:lang w:eastAsia="zh-CN"/>
-        </w:rPr>
-        <w:t xml:space="preserve">label=1 </w:t>
-      </w:r>
-      <w:r>
-        <w:rPr>
-          <w:color w:val="000000"/>
-          <w:sz w:val="21"/>
-          <w:lang w:eastAsia="zh-CN"/>
-        </w:rPr>
-        <w:t>的单条样例进行解释。解释内容由输入文本线索、模型预测标签与概率、训练集相似表达三部分组成。提示</w:t>
+        <w:t>图5、图6展示该样例的解释结果。依据包括文本线索、预测概率和训练集相似表达；相似案例仅用于模式参考，不等同于外部证据。解释在分类后生成，且不得修改模型标签。</w:t>
       </w:r>
       <w:proofErr w:type="gramStart"/>
-      <w:r>
-        <w:rPr>
-          <w:color w:val="000000"/>
-          <w:sz w:val="21"/>
-          <w:lang w:eastAsia="zh-CN"/>
-        </w:rPr>
-        <w:t>词明确</w:t>
-      </w:r>
       <w:proofErr w:type="gramEnd"/>
-      <w:r>
-        <w:rPr>
-          <w:color w:val="000000"/>
-          <w:sz w:val="21"/>
-          <w:lang w:eastAsia="zh-CN"/>
-        </w:rPr>
-        <w:t>限制解释范围：相似案例只作为模式参考，不等同于外部事实证据；</w:t>
-      </w:r>
-      <w:r>
-        <w:rPr>
-          <w:color w:val="000000"/>
-          <w:sz w:val="21"/>
-          <w:lang w:eastAsia="zh-CN"/>
-        </w:rPr>
-        <w:t xml:space="preserve">LLM </w:t>
-      </w:r>
-      <w:r>
-        <w:rPr>
-          <w:color w:val="000000"/>
-          <w:sz w:val="21"/>
-          <w:lang w:eastAsia="zh-CN"/>
-        </w:rPr>
-        <w:t>不得声称完成事实核查，也不得修改分类器标签。这种设计</w:t>
-      </w:r>
       <w:proofErr w:type="gramStart"/>
-      <w:r>
-        <w:rPr>
-          <w:color w:val="000000"/>
-          <w:sz w:val="21"/>
-          <w:lang w:eastAsia="zh-CN"/>
-        </w:rPr>
-        <w:t>把解释</w:t>
-      </w:r>
       <w:proofErr w:type="gramEnd"/>
-      <w:r>
-        <w:rPr>
-          <w:color w:val="000000"/>
-          <w:sz w:val="21"/>
-          <w:lang w:eastAsia="zh-CN"/>
-        </w:rPr>
-        <w:t>放在模型决策之后，降低</w:t>
-      </w:r>
-      <w:r>
-        <w:rPr>
-          <w:color w:val="000000"/>
-          <w:sz w:val="21"/>
-          <w:lang w:eastAsia="zh-CN"/>
-        </w:rPr>
-        <w:t>“</w:t>
-      </w:r>
-      <w:r>
-        <w:rPr>
-          <w:color w:val="000000"/>
-          <w:sz w:val="21"/>
-          <w:lang w:eastAsia="zh-CN"/>
-        </w:rPr>
-        <w:t>解释替代预测</w:t>
-      </w:r>
-      <w:r>
-        <w:rPr>
-          <w:color w:val="000000"/>
-          <w:sz w:val="21"/>
-          <w:lang w:eastAsia="zh-CN"/>
-        </w:rPr>
-        <w:t>”</w:t>
-      </w:r>
-      <w:r>
-        <w:rPr>
-          <w:color w:val="000000"/>
-          <w:sz w:val="21"/>
-          <w:lang w:eastAsia="zh-CN"/>
-        </w:rPr>
-        <w:t>的风险。</w:t>
-      </w:r>
     </w:p>
     <w:tbl>
       <w:tblPr>
@@ -5498,7 +4272,6 @@
         <w:spacing w:before="40" w:after="100" w:line="240" w:lineRule="auto"/>
         <w:jc w:val="center"/>
         <w:rPr>
-          <w:rFonts w:hint="eastAsia"/>
           <w:lang w:eastAsia="zh-CN"/>
         </w:rPr>
       </w:pPr>
@@ -6253,7 +5026,6 @@
         <w:spacing w:before="40" w:after="100" w:line="240" w:lineRule="auto"/>
         <w:jc w:val="center"/>
         <w:rPr>
-          <w:rFonts w:hint="eastAsia"/>
           <w:color w:val="404040"/>
           <w:sz w:val="21"/>
           <w:lang w:eastAsia="zh-CN"/>
@@ -6454,9 +5226,15 @@
           <w:sz w:val="24"/>
           <w:lang w:eastAsia="zh-CN"/>
         </w:rPr>
-        <w:t>（</w:t>
+        <w:t>（1）收获、心得：项目贯通了数据清洗、模型训练、指标评估、部署和可解释性设计，使我们理解了可运行系统不仅要关注准确率，还要保证流程可复现、结果可追溯、解释有边界。</w:t>
       </w:r>
-      <w:r>
+      <w:proofErr w:type="gramStart"/>
+      <w:proofErr w:type="gramEnd"/>
+    </w:p>
+    <w:p>
+      <w:pPr>
+        <w:keepNext/>
+        <w:spacing w:before="100" w:after="60" w:line="276" w:lineRule="auto"/>
         <w:rPr>
           <w:rFonts w:eastAsia="黑体"/>
           <w:b/>
@@ -6464,8 +5242,7 @@
           <w:sz w:val="24"/>
           <w:lang w:eastAsia="zh-CN"/>
         </w:rPr>
-        <w:t>1</w:t>
-      </w:r>
+      </w:pPr>
       <w:r>
         <w:rPr>
           <w:rFonts w:eastAsia="黑体"/>
@@ -6474,145 +5251,12 @@
           <w:sz w:val="24"/>
           <w:lang w:eastAsia="zh-CN"/>
         </w:rPr>
-        <w:t>）收获、心得：</w:t>
-      </w:r>
-      <w:r>
-        <w:rPr>
-          <w:rFonts w:ascii="宋体" w:hAnsi="宋体"/>
-          <w:bCs/>
-          <w:color w:val="000000"/>
-          <w:sz w:val="21"/>
-          <w:szCs w:val="21"/>
-          <w:lang w:eastAsia="zh-CN"/>
-        </w:rPr>
-        <w:t>本次大作业将课堂中的机器学习、深度学习、模型评估和</w:t>
+        <w:t>（2）遇到问题及解决思路：针对推文噪声、类别与事件不均衡、小样本训练困难，系统采用统一清洗、分事件建模、类别权重和阈值搜索；针对解释越界，使用受约束提示词限定 LLM 职责。</w:t>
       </w:r>
       <w:proofErr w:type="gramStart"/>
-      <w:r>
-        <w:rPr>
-          <w:rFonts w:ascii="宋体" w:hAnsi="宋体"/>
-          <w:bCs/>
-          <w:color w:val="000000"/>
-          <w:sz w:val="21"/>
-          <w:szCs w:val="21"/>
-          <w:lang w:eastAsia="zh-CN"/>
-        </w:rPr>
-        <w:t>可</w:t>
-      </w:r>
       <w:proofErr w:type="gramEnd"/>
-      <w:r>
-        <w:rPr>
-          <w:rFonts w:ascii="宋体" w:hAnsi="宋体"/>
-          <w:bCs/>
-          <w:color w:val="000000"/>
-          <w:sz w:val="21"/>
-          <w:szCs w:val="21"/>
-          <w:lang w:eastAsia="zh-CN"/>
-        </w:rPr>
-        <w:t>解释性要求串成了完整工程流程。相比只训练一个分类器，项目更强调数据清洗、阈值选择、错误分析、部署复现和解释边界，对“模型能跑”和“结果可信”有了更直接的理解。</w:t>
-      </w:r>
-    </w:p>
-    <w:p>
-      <w:pPr>
-        <w:keepNext/>
-        <w:spacing w:before="100" w:after="60" w:line="276" w:lineRule="auto"/>
-        <w:rPr>
-          <w:rFonts w:eastAsia="黑体"/>
-          <w:b/>
-          <w:color w:val="000000"/>
-          <w:sz w:val="24"/>
-          <w:lang w:eastAsia="zh-CN"/>
-        </w:rPr>
-      </w:pPr>
-      <w:r>
-        <w:rPr>
-          <w:rFonts w:eastAsia="黑体"/>
-          <w:b/>
-          <w:color w:val="000000"/>
-          <w:sz w:val="24"/>
-          <w:lang w:eastAsia="zh-CN"/>
-        </w:rPr>
-        <w:t>（</w:t>
-      </w:r>
-      <w:r>
-        <w:rPr>
-          <w:rFonts w:eastAsia="黑体"/>
-          <w:b/>
-          <w:color w:val="000000"/>
-          <w:sz w:val="24"/>
-          <w:lang w:eastAsia="zh-CN"/>
-        </w:rPr>
-        <w:t>2</w:t>
-      </w:r>
-      <w:r>
-        <w:rPr>
-          <w:rFonts w:eastAsia="黑体"/>
-          <w:b/>
-          <w:color w:val="000000"/>
-          <w:sz w:val="24"/>
-          <w:lang w:eastAsia="zh-CN"/>
-        </w:rPr>
-        <w:t>）遇到问题及解决思路：</w:t>
-      </w:r>
-      <w:r>
-        <w:rPr>
-          <w:rFonts w:ascii="宋体" w:hAnsi="宋体"/>
-          <w:bCs/>
-          <w:color w:val="000000"/>
-          <w:sz w:val="21"/>
-          <w:szCs w:val="21"/>
-          <w:lang w:eastAsia="zh-CN"/>
-        </w:rPr>
-        <w:t>主要问题</w:t>
-      </w:r>
       <w:proofErr w:type="gramStart"/>
-      <w:r>
-        <w:rPr>
-          <w:rFonts w:ascii="宋体" w:hAnsi="宋体"/>
-          <w:bCs/>
-          <w:color w:val="000000"/>
-          <w:sz w:val="21"/>
-          <w:szCs w:val="21"/>
-          <w:lang w:eastAsia="zh-CN"/>
-        </w:rPr>
-        <w:t>包括推文噪声</w:t>
-      </w:r>
       <w:proofErr w:type="gramEnd"/>
-      <w:r>
-        <w:rPr>
-          <w:rFonts w:ascii="宋体" w:hAnsi="宋体"/>
-          <w:bCs/>
-          <w:color w:val="000000"/>
-          <w:sz w:val="21"/>
-          <w:szCs w:val="21"/>
-          <w:lang w:eastAsia="zh-CN"/>
-        </w:rPr>
-        <w:t>较多、事件分布不均、小样本事件难训练、解释容易越界。解决思路是统一清洗流程，按事件训练模型，使用类别权重和阈值搜索缓解不平衡，并通过受约束提示</w:t>
-      </w:r>
-      <w:proofErr w:type="gramStart"/>
-      <w:r>
-        <w:rPr>
-          <w:rFonts w:ascii="宋体" w:hAnsi="宋体"/>
-          <w:bCs/>
-          <w:color w:val="000000"/>
-          <w:sz w:val="21"/>
-          <w:szCs w:val="21"/>
-          <w:lang w:eastAsia="zh-CN"/>
-        </w:rPr>
-        <w:t>词限制</w:t>
-      </w:r>
-      <w:proofErr w:type="gramEnd"/>
-      <w:r>
-        <w:rPr>
-          <w:rFonts w:ascii="宋体" w:hAnsi="宋体"/>
-          <w:bCs/>
-          <w:color w:val="000000"/>
-          <w:sz w:val="21"/>
-          <w:szCs w:val="21"/>
-          <w:lang w:eastAsia="zh-CN"/>
-        </w:rPr>
-        <w:t xml:space="preserve"> LLM 只解释模型依据。</w:t>
-      </w:r>
     </w:p>
     <w:p>
       <w:pPr>
@@ -6658,71 +5302,7 @@
           <w:sz w:val="21"/>
           <w:lang w:eastAsia="zh-CN"/>
         </w:rPr>
-        <w:t>建议课程继续保留开放题目形式，同时在支持文档中补充一份</w:t>
-      </w:r>
-      <w:r>
-        <w:rPr>
-          <w:color w:val="000000"/>
-          <w:sz w:val="21"/>
-          <w:lang w:eastAsia="zh-CN"/>
-        </w:rPr>
-        <w:t>“</w:t>
-      </w:r>
-      <w:r>
-        <w:rPr>
-          <w:color w:val="000000"/>
-          <w:sz w:val="21"/>
-          <w:lang w:eastAsia="zh-CN"/>
-        </w:rPr>
-        <w:t>报告结构清单</w:t>
-      </w:r>
-      <w:r>
-        <w:rPr>
-          <w:color w:val="000000"/>
-          <w:sz w:val="21"/>
-          <w:lang w:eastAsia="zh-CN"/>
-        </w:rPr>
-        <w:t>”</w:t>
-      </w:r>
-      <w:r>
-        <w:rPr>
-          <w:color w:val="000000"/>
-          <w:sz w:val="21"/>
-          <w:lang w:eastAsia="zh-CN"/>
-        </w:rPr>
-        <w:t>和</w:t>
-      </w:r>
-      <w:r>
-        <w:rPr>
-          <w:color w:val="000000"/>
-          <w:sz w:val="21"/>
-          <w:lang w:eastAsia="zh-CN"/>
-        </w:rPr>
-        <w:t>“</w:t>
-      </w:r>
-      <w:r>
-        <w:rPr>
-          <w:color w:val="000000"/>
-          <w:sz w:val="21"/>
-          <w:lang w:eastAsia="zh-CN"/>
-        </w:rPr>
-        <w:t>可解释性示例</w:t>
-      </w:r>
-      <w:r>
-        <w:rPr>
-          <w:color w:val="000000"/>
-          <w:sz w:val="21"/>
-          <w:lang w:eastAsia="zh-CN"/>
-        </w:rPr>
-        <w:t>”</w:t>
-      </w:r>
-      <w:r>
-        <w:rPr>
-          <w:color w:val="000000"/>
-          <w:sz w:val="21"/>
-          <w:lang w:eastAsia="zh-CN"/>
-        </w:rPr>
-        <w:t>，帮助小组更早明确评分重点。若条件允许，也可以提供统一的模型评测脚本或隐藏测试入口，使不同小组的准确率、运行时间和解释质量更容易横向比较。</w:t>
+        <w:t>建议课程保留开放题目，并在支持文档中增加报告结构清单、可解释性示例和统一评测脚本，便于各组明确评分重点并比较准确率、运行时间与解释质量。</w:t>
       </w:r>
     </w:p>
     <w:p>
@@ -6741,7 +5321,17 @@
           <w:sz w:val="30"/>
           <w:lang w:eastAsia="zh-CN"/>
         </w:rPr>
-        <w:t>9、小组协作与项目完成情况</w:t>
+        <w:t>9</w:t>
+      </w:r>
+      <w:r>
+        <w:rPr>
+          <w:rFonts w:eastAsia="黑体"/>
+          <w:b/>
+          <w:color w:val="000000"/>
+          <w:sz w:val="30"/>
+          <w:lang w:eastAsia="zh-CN"/>
+        </w:rPr>
+        <w:t>、小组协作与项目完成情况</w:t>
       </w:r>
     </w:p>
     <w:tbl>
@@ -7159,7 +5749,22 @@
           </w:tcPr>
           <w:p>
             <w:r>
-              <w:t>核验数据字段与标签分布；复查 val 指标、运行命令、checkpoint 与评测 JSON</w:t>
+              <w:t>核验数据字段与标签分布；复查</w:t>
+            </w:r>
+            <w:r>
+              <w:t xml:space="preserve"> val </w:t>
+            </w:r>
+            <w:r>
+              <w:t>指标、运行命令、</w:t>
+            </w:r>
+            <w:r>
+              <w:t xml:space="preserve">checkpoint </w:t>
+            </w:r>
+            <w:r>
+              <w:t>与评测</w:t>
+            </w:r>
+            <w:r>
+              <w:t xml:space="preserve"> JSON</w:t>
             </w:r>
           </w:p>
         </w:tc>
@@ -7172,6 +5777,17 @@
         <w:spacing w:before="320" w:after="160" w:line="324" w:lineRule="auto"/>
         <w:outlineLvl w:val="0"/>
         <w:rPr>
+          <w:rFonts w:ascii="黑体" w:eastAsia="黑体" w:hAnsi="黑体" w:cstheme="majorBidi" w:hint="eastAsia"/>
+          <w:b/>
+          <w:bCs/>
+          <w:color w:val="000000" w:themeColor="text1"/>
+          <w:sz w:val="30"/>
+          <w:szCs w:val="30"/>
+          <w:lang w:eastAsia="zh-CN"/>
+        </w:rPr>
+      </w:pPr>
+      <w:r>
+        <w:rPr>
           <w:rFonts w:ascii="黑体" w:eastAsia="黑体" w:hAnsi="黑体" w:cstheme="majorBidi"/>
           <w:b/>
           <w:bCs/>
@@ -7180,17 +5796,7 @@
           <w:szCs w:val="30"/>
           <w:lang w:eastAsia="zh-CN"/>
         </w:rPr>
-      </w:pPr>
-      <w:r>
-        <w:rPr>
-          <w:rFonts w:ascii="黑体" w:eastAsia="黑体" w:hAnsi="黑体" w:cstheme="majorBidi"/>
-          <w:b/>
-          <w:bCs/>
-          <w:color w:val="000000" w:themeColor="text1"/>
-          <w:sz w:val="30"/>
-          <w:szCs w:val="30"/>
-          <w:lang w:eastAsia="zh-CN"/>
-        </w:rPr>
+        <w:lastRenderedPageBreak/>
         <w:t>小组分工</w:t>
       </w:r>
       <w:r>
@@ -7252,7 +5858,7 @@
       <w:pPr>
         <w:spacing w:after="0" w:line="360" w:lineRule="atLeast"/>
         <w:rPr>
-          <w:rFonts w:ascii="微软雅黑" w:eastAsia="微软雅黑" w:hAnsi="微软雅黑" w:cs="Arial"/>
+          <w:rFonts w:ascii="微软雅黑" w:eastAsia="微软雅黑" w:hAnsi="微软雅黑" w:cs="Arial" w:hint="eastAsia"/>
           <w:color w:val="000000" w:themeColor="text1"/>
           <w:sz w:val="24"/>
           <w:szCs w:val="24"/>
@@ -7264,7 +5870,7 @@
       <w:pPr>
         <w:spacing w:after="0" w:line="360" w:lineRule="atLeast"/>
         <w:rPr>
-          <w:rFonts w:ascii="微软雅黑" w:eastAsia="微软雅黑" w:hAnsi="微软雅黑" w:cs="Arial"/>
+          <w:rFonts w:ascii="微软雅黑" w:eastAsia="微软雅黑" w:hAnsi="微软雅黑" w:cs="Arial" w:hint="eastAsia"/>
           <w:color w:val="000000" w:themeColor="text1"/>
           <w:sz w:val="24"/>
           <w:szCs w:val="24"/>
@@ -7306,7 +5912,7 @@
       <w:pPr>
         <w:spacing w:after="0" w:line="360" w:lineRule="atLeast"/>
         <w:rPr>
-          <w:rFonts w:ascii="微软雅黑" w:eastAsia="微软雅黑" w:hAnsi="微软雅黑" w:cs="Arial"/>
+          <w:rFonts w:ascii="微软雅黑" w:eastAsia="微软雅黑" w:hAnsi="微软雅黑" w:cs="Arial" w:hint="eastAsia"/>
           <w:color w:val="000000" w:themeColor="text1"/>
           <w:sz w:val="24"/>
           <w:szCs w:val="24"/>
@@ -7318,7 +5924,7 @@
       <w:pPr>
         <w:spacing w:after="0" w:line="360" w:lineRule="atLeast"/>
         <w:rPr>
-          <w:rFonts w:ascii="微软雅黑" w:eastAsia="微软雅黑" w:hAnsi="微软雅黑" w:cs="Arial"/>
+          <w:rFonts w:ascii="微软雅黑" w:eastAsia="微软雅黑" w:hAnsi="微软雅黑" w:cs="Arial" w:hint="eastAsia"/>
           <w:color w:val="000000" w:themeColor="text1"/>
           <w:sz w:val="24"/>
           <w:szCs w:val="24"/>
@@ -7360,7 +5966,7 @@
       <w:pPr>
         <w:spacing w:after="0" w:line="360" w:lineRule="atLeast"/>
         <w:rPr>
-          <w:rFonts w:ascii="微软雅黑" w:eastAsia="微软雅黑" w:hAnsi="微软雅黑" w:cs="Arial"/>
+          <w:rFonts w:ascii="微软雅黑" w:eastAsia="微软雅黑" w:hAnsi="微软雅黑" w:cs="Arial" w:hint="eastAsia"/>
           <w:color w:val="000000" w:themeColor="text1"/>
           <w:sz w:val="24"/>
           <w:szCs w:val="24"/>

</xml_diff>

<commit_message>
Clarify batch detection and lightweight RAG flow
</commit_message>
<xml_diff>
--- a/report_排版优化版.docx
+++ b/report_排版优化版.docx
@@ -1247,52 +1247,8 @@
             <w:vAlign w:val="center"/>
           </w:tcPr>
           <w:p>
-            <w:pPr>
-              <w:keepLines/>
-              <w:spacing w:after="0" w:line="252" w:lineRule="auto"/>
-              <w:rPr>
-                <w:lang w:eastAsia="zh-CN"/>
-              </w:rPr>
-            </w:pPr>
-            <w:r>
-              <w:rPr>
-                <w:color w:val="000000"/>
-                <w:sz w:val="21"/>
-                <w:lang w:eastAsia="zh-CN"/>
-              </w:rPr>
-              <w:t>关键词、</w:t>
-            </w:r>
-            <w:r>
-              <w:rPr>
-                <w:color w:val="000000"/>
-                <w:sz w:val="21"/>
-                <w:lang w:eastAsia="zh-CN"/>
-              </w:rPr>
-              <w:t xml:space="preserve">Top-K </w:t>
-            </w:r>
-            <w:r>
-              <w:rPr>
-                <w:color w:val="000000"/>
-                <w:sz w:val="21"/>
-                <w:lang w:eastAsia="zh-CN"/>
-              </w:rPr>
-              <w:t>相似案例、</w:t>
-            </w:r>
-            <w:r>
-              <w:rPr>
-                <w:color w:val="000000"/>
-                <w:sz w:val="21"/>
-                <w:lang w:eastAsia="zh-CN"/>
-              </w:rPr>
-              <w:t xml:space="preserve">SJTU API </w:t>
-            </w:r>
-            <w:r>
-              <w:rPr>
-                <w:color w:val="000000"/>
-                <w:sz w:val="21"/>
-                <w:lang w:eastAsia="zh-CN"/>
-              </w:rPr>
-              <w:t>受约束提示词</w:t>
+            <w:r>
+              <w:t>TF-IDF 余弦检索 + Top-K 相似案例 + 受约束 LLM（轻量级 RAG）</w:t>
             </w:r>
           </w:p>
         </w:tc>
@@ -1308,19 +1264,9 @@
             <w:vAlign w:val="center"/>
           </w:tcPr>
           <w:p>
-            <w:pPr>
-              <w:keepLines/>
-              <w:spacing w:after="0" w:line="252" w:lineRule="auto"/>
-            </w:pPr>
-            <w:proofErr w:type="spellStart"/>
-            <w:r>
-              <w:rPr>
-                <w:color w:val="000000"/>
-                <w:sz w:val="21"/>
-              </w:rPr>
-              <w:t>输出可信判断依据</w:t>
-            </w:r>
-            <w:proofErr w:type="spellEnd"/>
+            <w:r>
+              <w:t>生成可追溯中文依据</w:t>
+            </w:r>
           </w:p>
         </w:tc>
       </w:tr>
@@ -2814,6 +2760,21 @@
           <w:lang w:eastAsia="zh-CN"/>
         </w:rPr>
         <w:t>、检测结果分析（正确率等）</w:t>
+      </w:r>
+    </w:p>
+    <w:p>
+      <w:pPr>
+        <w:keepNext/>
+        <w:spacing w:before="100" w:after="60" w:line="276" w:lineRule="auto"/>
+      </w:pPr>
+      <w:r>
+        <w:rPr>
+          <w:rFonts w:eastAsia="黑体"/>
+          <w:b/>
+          <w:color w:val="000000"/>
+          <w:sz w:val="24"/>
+        </w:rPr>
+        <w:t>（1）批量检测结果说明</w:t>
       </w:r>
     </w:p>
     <w:p>
@@ -3417,26 +3378,35 @@
           <w:color w:val="000000"/>
           <w:sz w:val="24"/>
         </w:rPr>
-        <w:t>（</w:t>
+        <w:t>（2）单条检测样例说明</w:t>
       </w:r>
+    </w:p>
+    <w:p>
+      <w:pPr>
+        <w:spacing w:after="80" w:line="283" w:lineRule="auto"/>
+        <w:ind w:firstLine="420"/>
+        <w:jc w:val="both"/>
+        <w:rPr>
+          <w:lang w:eastAsia="zh-CN"/>
+        </w:rPr>
+      </w:pPr>
       <w:r>
         <w:rPr>
-          <w:rFonts w:eastAsia="黑体"/>
-          <w:b/>
           <w:color w:val="000000"/>
-          <w:sz w:val="24"/>
-        </w:rPr>
-        <w:t>1</w:t>
+          <w:sz w:val="21"/>
+        </w:rPr>
+        <w:t>单条检测在分类结果之外，新增两类概率、关键词证据、Top-K 相似训练样本和中文解释，便于追溯模型判断依据。</w:t>
       </w:r>
-      <w:r>
-        <w:rPr>
-          <w:rFonts w:eastAsia="黑体"/>
-          <w:b/>
-          <w:color w:val="000000"/>
-          <w:sz w:val="24"/>
-        </w:rPr>
-        <w:t>）单条检测样例说明</w:t>
-      </w:r>
+      <w:proofErr w:type="spellStart"/>
+      <w:proofErr w:type="spellEnd"/>
+      <w:proofErr w:type="spellStart"/>
+      <w:proofErr w:type="spellEnd"/>
+      <w:proofErr w:type="spellStart"/>
+      <w:proofErr w:type="spellEnd"/>
+      <w:proofErr w:type="spellStart"/>
+      <w:proofErr w:type="spellEnd"/>
+      <w:proofErr w:type="spellStart"/>
+      <w:proofErr w:type="spellEnd"/>
     </w:p>
     <w:p>
       <w:pPr>
@@ -3671,12 +3641,84 @@
           <w:sz w:val="21"/>
           <w:lang w:eastAsia="zh-CN"/>
         </w:rPr>
-        <w:t>图5、图6展示该样例的解释结果。依据包括文本线索、预测概率和训练集相似表达；相似案例仅用于模式参考，不等同于外部证据。解释在分类后生成，且不得修改模型标签。</w:t>
+        <w:t>解释模块采用 TF-IDF 检索增强的轻量级 RAG 技术，将训练集相似案例作为上下文，再由 LLM 生成受约束中文解释。流程如下：</w:t>
       </w:r>
       <w:proofErr w:type="gramStart"/>
       <w:proofErr w:type="gramEnd"/>
       <w:proofErr w:type="gramStart"/>
       <w:proofErr w:type="gramEnd"/>
+    </w:p>
+    <w:p>
+      <w:pPr>
+        <w:spacing w:after="80" w:line="283" w:lineRule="auto"/>
+        <w:ind w:firstLine="420"/>
+        <w:jc w:val="both"/>
+        <w:rPr>
+          <w:lang w:eastAsia="zh-CN"/>
+        </w:rPr>
+      </w:pPr>
+      <w:r>
+        <w:rPr>
+          <w:color w:val="000000"/>
+          <w:sz w:val="21"/>
+          <w:lang w:eastAsia="zh-CN"/>
+        </w:rPr>
+        <w:t>（1）索引构建：读取训练集，用 TF-IDF 将推文转为稀疏向量，并按余弦距离建立最近邻索引；输入新推文后检索 Top-K 相似样本。</w:t>
+      </w:r>
+    </w:p>
+    <w:p>
+      <w:pPr>
+        <w:spacing w:after="80" w:line="283" w:lineRule="auto"/>
+        <w:ind w:firstLine="420"/>
+        <w:jc w:val="both"/>
+        <w:rPr>
+          <w:lang w:eastAsia="zh-CN"/>
+        </w:rPr>
+      </w:pPr>
+      <w:r>
+        <w:rPr>
+          <w:color w:val="000000"/>
+          <w:sz w:val="21"/>
+          <w:lang w:eastAsia="zh-CN"/>
+        </w:rPr>
+        <w:t>（2）结果组织：每条检索结果包含训练推文文本、标签、事件和相似度。</w:t>
+      </w:r>
+    </w:p>
+    <w:p>
+      <w:pPr>
+        <w:spacing w:after="80" w:line="283" w:lineRule="auto"/>
+        <w:ind w:firstLine="420"/>
+        <w:jc w:val="both"/>
+        <w:rPr>
+          <w:lang w:eastAsia="zh-CN"/>
+        </w:rPr>
+      </w:pPr>
+      <w:r>
+        <w:rPr>
+          <w:color w:val="000000"/>
+          <w:sz w:val="21"/>
+          <w:lang w:eastAsia="zh-CN"/>
+        </w:rPr>
+        <w:t>（3）提示词增强：将相似案例格式化后写入 LLM 提示词，作为模式参考而非外部事实证据。</w:t>
+      </w:r>
+    </w:p>
+    <w:p>
+      <w:pPr>
+        <w:spacing w:after="80" w:line="283" w:lineRule="auto"/>
+        <w:ind w:firstLine="420"/>
+        <w:jc w:val="both"/>
+        <w:rPr>
+          <w:lang w:eastAsia="zh-CN"/>
+        </w:rPr>
+      </w:pPr>
+      <w:r>
+        <w:rPr>
+          <w:color w:val="000000"/>
+          <w:sz w:val="21"/>
+          <w:lang w:eastAsia="zh-CN"/>
+        </w:rPr>
+        <w:t>（4）解释生成：LLM 综合输入文本、分类器预测、关键词证据和相似案例生成中文解释，不修改分类标签。</w:t>
+      </w:r>
     </w:p>
     <w:tbl>
       <w:tblPr>

</xml_diff>